<commit_message>
Ajout de Estimation nutriscope, maj de la trame
</commit_message>
<xml_diff>
--- a/docs/cadrage/Trame_Adoption.docx
+++ b/docs/cadrage/Trame_Adoption.docx
@@ -52,14 +52,14 @@
         </w:tblCellMar>
       </w:tblPr>
       <w:tblGrid>
-        <w:gridCol w:w="2399"/>
-        <w:gridCol w:w="7239"/>
+        <w:gridCol w:w="2398"/>
+        <w:gridCol w:w="7240"/>
       </w:tblGrid>
       <w:tr>
         <w:trPr/>
         <w:tc>
           <w:tcPr>
-            <w:tcW w:w="2399" w:type="dxa"/>
+            <w:tcW w:w="2398" w:type="dxa"/>
             <w:tcBorders>
               <w:top w:val="single" w:sz="4" w:space="0" w:color="D5DFEC"/>
               <w:start w:val="single" w:sz="4" w:space="0" w:color="D5DFEC"/>
@@ -96,7 +96,7 @@
         </w:tc>
         <w:tc>
           <w:tcPr>
-            <w:tcW w:w="7239" w:type="dxa"/>
+            <w:tcW w:w="7240" w:type="dxa"/>
             <w:tcBorders>
               <w:top w:val="single" w:sz="4" w:space="0" w:color="D5DFEC"/>
               <w:start w:val="single" w:sz="4" w:space="0" w:color="D5DFEC"/>
@@ -130,7 +130,7 @@
         <w:trPr/>
         <w:tc>
           <w:tcPr>
-            <w:tcW w:w="2399" w:type="dxa"/>
+            <w:tcW w:w="2398" w:type="dxa"/>
             <w:tcBorders>
               <w:top w:val="single" w:sz="4" w:space="0" w:color="D5DFEC"/>
               <w:start w:val="single" w:sz="4" w:space="0" w:color="D5DFEC"/>
@@ -157,7 +157,7 @@
         </w:tc>
         <w:tc>
           <w:tcPr>
-            <w:tcW w:w="7239" w:type="dxa"/>
+            <w:tcW w:w="7240" w:type="dxa"/>
             <w:tcBorders>
               <w:top w:val="single" w:sz="4" w:space="0" w:color="D5DFEC"/>
               <w:start w:val="single" w:sz="4" w:space="0" w:color="D5DFEC"/>
@@ -328,9 +328,9 @@
       </w:tblPr>
       <w:tblGrid>
         <w:gridCol w:w="2100"/>
-        <w:gridCol w:w="1149"/>
+        <w:gridCol w:w="1148"/>
         <w:gridCol w:w="1500"/>
-        <w:gridCol w:w="1601"/>
+        <w:gridCol w:w="1602"/>
         <w:gridCol w:w="3288"/>
       </w:tblGrid>
       <w:tr>
@@ -369,7 +369,7 @@
         </w:tc>
         <w:tc>
           <w:tcPr>
-            <w:tcW w:w="1149" w:type="dxa"/>
+            <w:tcW w:w="1148" w:type="dxa"/>
             <w:tcBorders>
               <w:top w:val="single" w:sz="4" w:space="0" w:color="D5DFEC"/>
               <w:start w:val="single" w:sz="4" w:space="0" w:color="D5DFEC"/>
@@ -429,7 +429,7 @@
         </w:tc>
         <w:tc>
           <w:tcPr>
-            <w:tcW w:w="1601" w:type="dxa"/>
+            <w:tcW w:w="1602" w:type="dxa"/>
             <w:tcBorders>
               <w:top w:val="single" w:sz="4" w:space="0" w:color="D5DFEC"/>
               <w:start w:val="single" w:sz="4" w:space="0" w:color="D5DFEC"/>
@@ -529,7 +529,7 @@
         </w:tc>
         <w:tc>
           <w:tcPr>
-            <w:tcW w:w="1149" w:type="dxa"/>
+            <w:tcW w:w="1148" w:type="dxa"/>
             <w:tcBorders>
               <w:top w:val="single" w:sz="4" w:space="0" w:color="D5DFEC"/>
               <w:start w:val="single" w:sz="4" w:space="0" w:color="D5DFEC"/>
@@ -583,7 +583,7 @@
         </w:tc>
         <w:tc>
           <w:tcPr>
-            <w:tcW w:w="1601" w:type="dxa"/>
+            <w:tcW w:w="1602" w:type="dxa"/>
             <w:tcBorders>
               <w:top w:val="single" w:sz="4" w:space="0" w:color="D5DFEC"/>
               <w:start w:val="single" w:sz="4" w:space="0" w:color="D5DFEC"/>
@@ -697,7 +697,7 @@
         </w:tc>
         <w:tc>
           <w:tcPr>
-            <w:tcW w:w="1149" w:type="dxa"/>
+            <w:tcW w:w="1148" w:type="dxa"/>
             <w:tcBorders>
               <w:top w:val="single" w:sz="4" w:space="0" w:color="D5DFEC"/>
               <w:start w:val="single" w:sz="4" w:space="0" w:color="D5DFEC"/>
@@ -751,7 +751,7 @@
         </w:tc>
         <w:tc>
           <w:tcPr>
-            <w:tcW w:w="1601" w:type="dxa"/>
+            <w:tcW w:w="1602" w:type="dxa"/>
             <w:tcBorders>
               <w:top w:val="single" w:sz="4" w:space="0" w:color="D5DFEC"/>
               <w:start w:val="single" w:sz="4" w:space="0" w:color="D5DFEC"/>
@@ -835,7 +835,7 @@
         </w:tc>
         <w:tc>
           <w:tcPr>
-            <w:tcW w:w="1149" w:type="dxa"/>
+            <w:tcW w:w="1148" w:type="dxa"/>
             <w:tcBorders>
               <w:top w:val="single" w:sz="4" w:space="0" w:color="D5DFEC"/>
               <w:start w:val="single" w:sz="4" w:space="0" w:color="D5DFEC"/>
@@ -889,7 +889,7 @@
         </w:tc>
         <w:tc>
           <w:tcPr>
-            <w:tcW w:w="1601" w:type="dxa"/>
+            <w:tcW w:w="1602" w:type="dxa"/>
             <w:tcBorders>
               <w:top w:val="single" w:sz="4" w:space="0" w:color="D5DFEC"/>
               <w:start w:val="single" w:sz="4" w:space="0" w:color="D5DFEC"/>
@@ -983,7 +983,7 @@
         </w:tc>
         <w:tc>
           <w:tcPr>
-            <w:tcW w:w="1149" w:type="dxa"/>
+            <w:tcW w:w="1148" w:type="dxa"/>
             <w:tcBorders>
               <w:top w:val="single" w:sz="4" w:space="0" w:color="D5DFEC"/>
               <w:start w:val="single" w:sz="4" w:space="0" w:color="D5DFEC"/>
@@ -1047,7 +1047,7 @@
         </w:tc>
         <w:tc>
           <w:tcPr>
-            <w:tcW w:w="1601" w:type="dxa"/>
+            <w:tcW w:w="1602" w:type="dxa"/>
             <w:tcBorders>
               <w:top w:val="single" w:sz="4" w:space="0" w:color="D5DFEC"/>
               <w:start w:val="single" w:sz="4" w:space="0" w:color="D5DFEC"/>
@@ -1141,7 +1141,7 @@
         </w:tc>
         <w:tc>
           <w:tcPr>
-            <w:tcW w:w="1149" w:type="dxa"/>
+            <w:tcW w:w="1148" w:type="dxa"/>
             <w:tcBorders>
               <w:top w:val="single" w:sz="4" w:space="0" w:color="D5DFEC"/>
               <w:start w:val="single" w:sz="4" w:space="0" w:color="D5DFEC"/>
@@ -1205,7 +1205,7 @@
         </w:tc>
         <w:tc>
           <w:tcPr>
-            <w:tcW w:w="1601" w:type="dxa"/>
+            <w:tcW w:w="1602" w:type="dxa"/>
             <w:tcBorders>
               <w:top w:val="single" w:sz="4" w:space="0" w:color="D5DFEC"/>
               <w:start w:val="single" w:sz="4" w:space="0" w:color="D5DFEC"/>
@@ -1309,7 +1309,7 @@
         </w:tc>
         <w:tc>
           <w:tcPr>
-            <w:tcW w:w="1149" w:type="dxa"/>
+            <w:tcW w:w="1148" w:type="dxa"/>
             <w:tcBorders>
               <w:top w:val="single" w:sz="4" w:space="0" w:color="D5DFEC"/>
               <w:start w:val="single" w:sz="4" w:space="0" w:color="D5DFEC"/>
@@ -1373,7 +1373,7 @@
         </w:tc>
         <w:tc>
           <w:tcPr>
-            <w:tcW w:w="1601" w:type="dxa"/>
+            <w:tcW w:w="1602" w:type="dxa"/>
             <w:tcBorders>
               <w:top w:val="single" w:sz="4" w:space="0" w:color="D5DFEC"/>
               <w:start w:val="single" w:sz="4" w:space="0" w:color="D5DFEC"/>
@@ -1477,7 +1477,7 @@
         </w:tc>
         <w:tc>
           <w:tcPr>
-            <w:tcW w:w="1149" w:type="dxa"/>
+            <w:tcW w:w="1148" w:type="dxa"/>
             <w:tcBorders>
               <w:top w:val="single" w:sz="4" w:space="0" w:color="D5DFEC"/>
               <w:start w:val="single" w:sz="4" w:space="0" w:color="D5DFEC"/>
@@ -1541,7 +1541,7 @@
         </w:tc>
         <w:tc>
           <w:tcPr>
-            <w:tcW w:w="1601" w:type="dxa"/>
+            <w:tcW w:w="1602" w:type="dxa"/>
             <w:tcBorders>
               <w:top w:val="single" w:sz="4" w:space="0" w:color="D5DFEC"/>
               <w:start w:val="single" w:sz="4" w:space="0" w:color="D5DFEC"/>
@@ -1635,7 +1635,7 @@
         </w:tc>
         <w:tc>
           <w:tcPr>
-            <w:tcW w:w="1149" w:type="dxa"/>
+            <w:tcW w:w="1148" w:type="dxa"/>
             <w:tcBorders>
               <w:top w:val="single" w:sz="4" w:space="0" w:color="D5DFEC"/>
               <w:start w:val="single" w:sz="4" w:space="0" w:color="D5DFEC"/>
@@ -1699,7 +1699,7 @@
         </w:tc>
         <w:tc>
           <w:tcPr>
-            <w:tcW w:w="1601" w:type="dxa"/>
+            <w:tcW w:w="1602" w:type="dxa"/>
             <w:tcBorders>
               <w:top w:val="single" w:sz="4" w:space="0" w:color="D5DFEC"/>
               <w:start w:val="single" w:sz="4" w:space="0" w:color="D5DFEC"/>
@@ -1793,7 +1793,7 @@
         </w:tc>
         <w:tc>
           <w:tcPr>
-            <w:tcW w:w="1149" w:type="dxa"/>
+            <w:tcW w:w="1148" w:type="dxa"/>
             <w:tcBorders>
               <w:top w:val="single" w:sz="4" w:space="0" w:color="D5DFEC"/>
               <w:start w:val="single" w:sz="4" w:space="0" w:color="D5DFEC"/>
@@ -1857,7 +1857,7 @@
         </w:tc>
         <w:tc>
           <w:tcPr>
-            <w:tcW w:w="1601" w:type="dxa"/>
+            <w:tcW w:w="1602" w:type="dxa"/>
             <w:tcBorders>
               <w:top w:val="single" w:sz="4" w:space="0" w:color="D5DFEC"/>
               <w:start w:val="single" w:sz="4" w:space="0" w:color="D5DFEC"/>
@@ -1946,7 +1946,7 @@
         </w:tc>
         <w:tc>
           <w:tcPr>
-            <w:tcW w:w="1149" w:type="dxa"/>
+            <w:tcW w:w="1148" w:type="dxa"/>
             <w:tcBorders>
               <w:top w:val="single" w:sz="4" w:space="0" w:color="D5DFEC"/>
               <w:start w:val="single" w:sz="4" w:space="0" w:color="D5DFEC"/>
@@ -2000,7 +2000,7 @@
         </w:tc>
         <w:tc>
           <w:tcPr>
-            <w:tcW w:w="1601" w:type="dxa"/>
+            <w:tcW w:w="1602" w:type="dxa"/>
             <w:tcBorders>
               <w:top w:val="single" w:sz="4" w:space="0" w:color="D5DFEC"/>
               <w:start w:val="single" w:sz="4" w:space="0" w:color="D5DFEC"/>
@@ -2048,15 +2048,7 @@
             </w:pPr>
             <w:r>
               <w:rPr/>
-              <w:t xml:space="preserve">Rédiger et envoyer une charte de neutralité </w:t>
-            </w:r>
-            <w:r>
-              <w:rPr/>
-              <w:t>a</w:t>
-            </w:r>
-            <w:r>
-              <w:rPr/>
-              <w:t xml:space="preserve">ux 10 plus grandes marques référencées </w:t>
+              <w:t xml:space="preserve">Rédiger et envoyer une charte de neutralité aux 10 plus grandes marques référencées </w:t>
             </w:r>
           </w:p>
           <w:p>
@@ -2097,7 +2089,7 @@
         </w:tc>
         <w:tc>
           <w:tcPr>
-            <w:tcW w:w="1149" w:type="dxa"/>
+            <w:tcW w:w="1148" w:type="dxa"/>
             <w:tcBorders>
               <w:top w:val="single" w:sz="4" w:space="0" w:color="D5DFEC"/>
               <w:start w:val="single" w:sz="4" w:space="0" w:color="D5DFEC"/>
@@ -2151,7 +2143,7 @@
         </w:tc>
         <w:tc>
           <w:tcPr>
-            <w:tcW w:w="1601" w:type="dxa"/>
+            <w:tcW w:w="1602" w:type="dxa"/>
             <w:tcBorders>
               <w:top w:val="single" w:sz="4" w:space="0" w:color="D5DFEC"/>
               <w:start w:val="single" w:sz="4" w:space="0" w:color="D5DFEC"/>
@@ -2266,8 +2258,8 @@
       </w:tblPr>
       <w:tblGrid>
         <w:gridCol w:w="2500"/>
-        <w:gridCol w:w="1399"/>
-        <w:gridCol w:w="5739"/>
+        <w:gridCol w:w="1398"/>
+        <w:gridCol w:w="5740"/>
       </w:tblGrid>
       <w:tr>
         <w:trPr>
@@ -2305,7 +2297,7 @@
         </w:tc>
         <w:tc>
           <w:tcPr>
-            <w:tcW w:w="1399" w:type="dxa"/>
+            <w:tcW w:w="1398" w:type="dxa"/>
             <w:tcBorders>
               <w:top w:val="single" w:sz="4" w:space="0" w:color="D5DFEC"/>
               <w:start w:val="single" w:sz="4" w:space="0" w:color="D5DFEC"/>
@@ -2335,7 +2327,7 @@
         </w:tc>
         <w:tc>
           <w:tcPr>
-            <w:tcW w:w="5739" w:type="dxa"/>
+            <w:tcW w:w="5740" w:type="dxa"/>
             <w:tcBorders>
               <w:top w:val="single" w:sz="4" w:space="0" w:color="D5DFEC"/>
               <w:start w:val="single" w:sz="4" w:space="0" w:color="D5DFEC"/>
@@ -2390,7 +2382,7 @@
         </w:tc>
         <w:tc>
           <w:tcPr>
-            <w:tcW w:w="1399" w:type="dxa"/>
+            <w:tcW w:w="1398" w:type="dxa"/>
             <w:tcBorders>
               <w:top w:val="single" w:sz="4" w:space="0" w:color="D5DFEC"/>
               <w:start w:val="single" w:sz="4" w:space="0" w:color="D5DFEC"/>
@@ -2412,7 +2404,7 @@
         </w:tc>
         <w:tc>
           <w:tcPr>
-            <w:tcW w:w="5739" w:type="dxa"/>
+            <w:tcW w:w="5740" w:type="dxa"/>
             <w:tcBorders>
               <w:top w:val="single" w:sz="4" w:space="0" w:color="D5DFEC"/>
               <w:start w:val="single" w:sz="4" w:space="0" w:color="D5DFEC"/>
@@ -2434,23 +2426,7 @@
             </w:r>
             <w:r>
               <w:rPr/>
-              <w:t xml:space="preserve"> le moteur de substitution ne doit pas raisonner uniquement sur nutriscore/additifs génériques </w:t>
-            </w:r>
-            <w:r>
-              <w:rPr/>
-              <w:t>i</w:t>
-            </w:r>
-            <w:r>
-              <w:rPr/>
-              <w:t xml:space="preserve">l lui </w:t>
-            </w:r>
-            <w:r>
-              <w:rPr/>
-              <w:t>faux</w:t>
-            </w:r>
-            <w:r>
-              <w:rPr/>
-              <w:t xml:space="preserve"> une couche de contre-indications médicales.</w:t>
+              <w:t xml:space="preserve"> le moteur de substitution ne doit pas raisonner uniquement sur nutriscore/additifs génériques il lui faux une couche de contre-indications médicales.</w:t>
             </w:r>
           </w:p>
           <w:p>
@@ -2518,7 +2494,7 @@
         </w:tc>
         <w:tc>
           <w:tcPr>
-            <w:tcW w:w="1399" w:type="dxa"/>
+            <w:tcW w:w="1398" w:type="dxa"/>
             <w:tcBorders>
               <w:top w:val="single" w:sz="4" w:space="0" w:color="D5DFEC"/>
               <w:start w:val="single" w:sz="4" w:space="0" w:color="D5DFEC"/>
@@ -2540,7 +2516,7 @@
         </w:tc>
         <w:tc>
           <w:tcPr>
-            <w:tcW w:w="5739" w:type="dxa"/>
+            <w:tcW w:w="5740" w:type="dxa"/>
             <w:tcBorders>
               <w:top w:val="single" w:sz="4" w:space="0" w:color="D5DFEC"/>
               <w:start w:val="single" w:sz="4" w:space="0" w:color="D5DFEC"/>
@@ -2636,7 +2612,7 @@
         </w:tc>
         <w:tc>
           <w:tcPr>
-            <w:tcW w:w="1399" w:type="dxa"/>
+            <w:tcW w:w="1398" w:type="dxa"/>
             <w:tcBorders>
               <w:top w:val="single" w:sz="4" w:space="0" w:color="D5DFEC"/>
               <w:start w:val="single" w:sz="4" w:space="0" w:color="D5DFEC"/>
@@ -2668,7 +2644,7 @@
         </w:tc>
         <w:tc>
           <w:tcPr>
-            <w:tcW w:w="5739" w:type="dxa"/>
+            <w:tcW w:w="5740" w:type="dxa"/>
             <w:tcBorders>
               <w:top w:val="single" w:sz="4" w:space="0" w:color="D5DFEC"/>
               <w:start w:val="single" w:sz="4" w:space="0" w:color="D5DFEC"/>
@@ -2690,15 +2666,7 @@
             </w:r>
             <w:r>
               <w:rPr/>
-              <w:t xml:space="preserve"> </w:t>
-            </w:r>
-            <w:r>
-              <w:rPr/>
-              <w:t>cela</w:t>
-            </w:r>
-            <w:r>
-              <w:rPr/>
-              <w:t xml:space="preserve"> révèle que NutriScope n'a pas encore défini publiquement ses critères de scoring pour les substitutions. Tant que l'algorithme est une boîte noire, n'importe quel acteur peut soupçonner un biais</w:t>
+              <w:t xml:space="preserve"> cela révèle que NutriScope n'a pas encore défini publiquement ses critères de scoring pour les substitutions. Tant que l'algorithme est une boîte noire, n'importe quel acteur peut soupçonner un biais</w:t>
             </w:r>
           </w:p>
           <w:p>
@@ -2755,8 +2723,8 @@
       </w:tblPr>
       <w:tblGrid>
         <w:gridCol w:w="2500"/>
-        <w:gridCol w:w="1399"/>
-        <w:gridCol w:w="5739"/>
+        <w:gridCol w:w="1398"/>
+        <w:gridCol w:w="5740"/>
       </w:tblGrid>
       <w:tr>
         <w:trPr>
@@ -2794,7 +2762,7 @@
         </w:tc>
         <w:tc>
           <w:tcPr>
-            <w:tcW w:w="1399" w:type="dxa"/>
+            <w:tcW w:w="1398" w:type="dxa"/>
             <w:tcBorders>
               <w:top w:val="single" w:sz="4" w:space="0" w:color="D5DFEC"/>
               <w:start w:val="single" w:sz="4" w:space="0" w:color="D5DFEC"/>
@@ -2824,7 +2792,7 @@
         </w:tc>
         <w:tc>
           <w:tcPr>
-            <w:tcW w:w="5739" w:type="dxa"/>
+            <w:tcW w:w="5740" w:type="dxa"/>
             <w:tcBorders>
               <w:top w:val="single" w:sz="4" w:space="0" w:color="D5DFEC"/>
               <w:start w:val="single" w:sz="4" w:space="0" w:color="D5DFEC"/>
@@ -2873,21 +2841,13 @@
             </w:pPr>
             <w:r>
               <w:rPr/>
-              <w:t xml:space="preserve">L'utilisateur diabétique ne fait pas confiance à une IA pour une recommandation </w:t>
-            </w:r>
-            <w:r>
-              <w:rPr/>
-              <w:t>qui peut impacter sa santé</w:t>
-            </w:r>
-            <w:r>
-              <w:rPr/>
-              <w:t xml:space="preserve">, après avoir vu des exemples d'IA générative qui se trompent </w:t>
-            </w:r>
-          </w:p>
-        </w:tc>
-        <w:tc>
-          <w:tcPr>
-            <w:tcW w:w="1399" w:type="dxa"/>
+              <w:t xml:space="preserve">L'utilisateur diabétique ne fait pas confiance à une IA pour une recommandation qui peut impacter sa santé, après avoir vu des exemples d'IA générative qui se trompent </w:t>
+            </w:r>
+          </w:p>
+        </w:tc>
+        <w:tc>
+          <w:tcPr>
+            <w:tcW w:w="1398" w:type="dxa"/>
             <w:tcBorders>
               <w:top w:val="single" w:sz="4" w:space="0" w:color="D5DFEC"/>
               <w:start w:val="single" w:sz="4" w:space="0" w:color="D5DFEC"/>
@@ -2929,7 +2889,7 @@
         </w:tc>
         <w:tc>
           <w:tcPr>
-            <w:tcW w:w="5739" w:type="dxa"/>
+            <w:tcW w:w="5740" w:type="dxa"/>
             <w:tcBorders>
               <w:top w:val="single" w:sz="4" w:space="0" w:color="D5DFEC"/>
               <w:start w:val="single" w:sz="4" w:space="0" w:color="D5DFEC"/>
@@ -3017,7 +2977,7 @@
         </w:tc>
         <w:tc>
           <w:tcPr>
-            <w:tcW w:w="1399" w:type="dxa"/>
+            <w:tcW w:w="1398" w:type="dxa"/>
             <w:tcBorders>
               <w:top w:val="single" w:sz="4" w:space="0" w:color="D5DFEC"/>
               <w:start w:val="single" w:sz="4" w:space="0" w:color="D5DFEC"/>
@@ -3059,7 +3019,7 @@
         </w:tc>
         <w:tc>
           <w:tcPr>
-            <w:tcW w:w="5739" w:type="dxa"/>
+            <w:tcW w:w="5740" w:type="dxa"/>
             <w:tcBorders>
               <w:top w:val="single" w:sz="4" w:space="0" w:color="D5DFEC"/>
               <w:start w:val="single" w:sz="4" w:space="0" w:color="D5DFEC"/>
@@ -3081,19 +3041,7 @@
             </w:r>
             <w:r>
               <w:rPr/>
-              <w:t xml:space="preserve"> le moteur de substitution optimise sur des critères </w:t>
-            </w:r>
-            <w:r>
-              <w:rPr/>
-              <w:t>nutrition/</w:t>
-            </w:r>
-            <w:r>
-              <w:rPr/>
-              <w:t>santé sans intégrer de contrainte budgétaire, donc il n'est pas utilisable pour une partie d</w:t>
-            </w:r>
-            <w:r>
-              <w:rPr/>
-              <w:t>e la cible</w:t>
+              <w:t xml:space="preserve"> le moteur de substitution optimise sur des critères nutrition/santé sans intégrer de contrainte budgétaire, donc il n'est pas utilisable pour une partie de la cible</w:t>
             </w:r>
           </w:p>
           <w:p>
@@ -3141,7 +3089,7 @@
         </w:tc>
         <w:tc>
           <w:tcPr>
-            <w:tcW w:w="1399" w:type="dxa"/>
+            <w:tcW w:w="1398" w:type="dxa"/>
             <w:tcBorders>
               <w:top w:val="single" w:sz="4" w:space="0" w:color="D5DFEC"/>
               <w:start w:val="single" w:sz="4" w:space="0" w:color="D5DFEC"/>
@@ -3183,7 +3131,7 @@
         </w:tc>
         <w:tc>
           <w:tcPr>
-            <w:tcW w:w="5739" w:type="dxa"/>
+            <w:tcW w:w="5740" w:type="dxa"/>
             <w:tcBorders>
               <w:top w:val="single" w:sz="4" w:space="0" w:color="D5DFEC"/>
               <w:start w:val="single" w:sz="4" w:space="0" w:color="D5DFEC"/>
@@ -3350,8 +3298,8 @@
         </w:tblCellMar>
       </w:tblPr>
       <w:tblGrid>
-        <w:gridCol w:w="1499"/>
-        <w:gridCol w:w="1614"/>
+        <w:gridCol w:w="1498"/>
+        <w:gridCol w:w="1615"/>
         <w:gridCol w:w="3987"/>
         <w:gridCol w:w="2538"/>
       </w:tblGrid>
@@ -3361,7 +3309,7 @@
         </w:trPr>
         <w:tc>
           <w:tcPr>
-            <w:tcW w:w="1499" w:type="dxa"/>
+            <w:tcW w:w="1498" w:type="dxa"/>
             <w:tcBorders>
               <w:top w:val="single" w:sz="4" w:space="0" w:color="D5DFEC"/>
               <w:start w:val="single" w:sz="4" w:space="0" w:color="D5DFEC"/>
@@ -3391,7 +3339,7 @@
         </w:tc>
         <w:tc>
           <w:tcPr>
-            <w:tcW w:w="1614" w:type="dxa"/>
+            <w:tcW w:w="1615" w:type="dxa"/>
             <w:tcBorders>
               <w:top w:val="single" w:sz="4" w:space="0" w:color="D5DFEC"/>
               <w:start w:val="single" w:sz="4" w:space="0" w:color="D5DFEC"/>
@@ -3484,7 +3432,7 @@
         <w:trPr/>
         <w:tc>
           <w:tcPr>
-            <w:tcW w:w="1499" w:type="dxa"/>
+            <w:tcW w:w="1498" w:type="dxa"/>
             <w:tcBorders>
               <w:top w:val="single" w:sz="4" w:space="0" w:color="D5DFEC"/>
               <w:start w:val="single" w:sz="4" w:space="0" w:color="D5DFEC"/>
@@ -3511,7 +3459,7 @@
         </w:tc>
         <w:tc>
           <w:tcPr>
-            <w:tcW w:w="1614" w:type="dxa"/>
+            <w:tcW w:w="1615" w:type="dxa"/>
             <w:tcBorders>
               <w:top w:val="single" w:sz="4" w:space="0" w:color="D5DFEC"/>
               <w:start w:val="single" w:sz="4" w:space="0" w:color="D5DFEC"/>
@@ -3620,7 +3568,7 @@
         <w:trPr/>
         <w:tc>
           <w:tcPr>
-            <w:tcW w:w="1499" w:type="dxa"/>
+            <w:tcW w:w="1498" w:type="dxa"/>
             <w:tcBorders>
               <w:start w:val="single" w:sz="4" w:space="0" w:color="D5DFEC"/>
               <w:bottom w:val="single" w:sz="4" w:space="0" w:color="D5DFEC"/>
@@ -3646,7 +3594,7 @@
         </w:tc>
         <w:tc>
           <w:tcPr>
-            <w:tcW w:w="1614" w:type="dxa"/>
+            <w:tcW w:w="1615" w:type="dxa"/>
             <w:tcBorders>
               <w:start w:val="single" w:sz="4" w:space="0" w:color="D5DFEC"/>
               <w:bottom w:val="single" w:sz="4" w:space="0" w:color="D5DFEC"/>
@@ -3712,7 +3660,7 @@
         <w:trPr/>
         <w:tc>
           <w:tcPr>
-            <w:tcW w:w="1499" w:type="dxa"/>
+            <w:tcW w:w="1498" w:type="dxa"/>
             <w:tcBorders>
               <w:top w:val="single" w:sz="4" w:space="0" w:color="D5DFEC"/>
               <w:start w:val="single" w:sz="4" w:space="0" w:color="D5DFEC"/>
@@ -3769,7 +3717,7 @@
         </w:tc>
         <w:tc>
           <w:tcPr>
-            <w:tcW w:w="1614" w:type="dxa"/>
+            <w:tcW w:w="1615" w:type="dxa"/>
             <w:tcBorders>
               <w:top w:val="single" w:sz="4" w:space="0" w:color="D5DFEC"/>
               <w:start w:val="single" w:sz="4" w:space="0" w:color="D5DFEC"/>
@@ -3898,7 +3846,7 @@
         <w:trPr/>
         <w:tc>
           <w:tcPr>
-            <w:tcW w:w="1499" w:type="dxa"/>
+            <w:tcW w:w="1498" w:type="dxa"/>
             <w:tcBorders>
               <w:start w:val="single" w:sz="4" w:space="0" w:color="D5DFEC"/>
               <w:bottom w:val="single" w:sz="4" w:space="0" w:color="D5DFEC"/>
@@ -3919,7 +3867,7 @@
         </w:tc>
         <w:tc>
           <w:tcPr>
-            <w:tcW w:w="1614" w:type="dxa"/>
+            <w:tcW w:w="1615" w:type="dxa"/>
             <w:tcBorders>
               <w:start w:val="single" w:sz="4" w:space="0" w:color="D5DFEC"/>
               <w:bottom w:val="single" w:sz="4" w:space="0" w:color="D5DFEC"/>
@@ -3985,7 +3933,7 @@
         <w:trPr/>
         <w:tc>
           <w:tcPr>
-            <w:tcW w:w="1499" w:type="dxa"/>
+            <w:tcW w:w="1498" w:type="dxa"/>
             <w:tcBorders>
               <w:top w:val="single" w:sz="4" w:space="0" w:color="D5DFEC"/>
               <w:start w:val="single" w:sz="4" w:space="0" w:color="D5DFEC"/>
@@ -4022,7 +3970,7 @@
         </w:tc>
         <w:tc>
           <w:tcPr>
-            <w:tcW w:w="1614" w:type="dxa"/>
+            <w:tcW w:w="1615" w:type="dxa"/>
             <w:tcBorders>
               <w:top w:val="single" w:sz="4" w:space="0" w:color="D5DFEC"/>
               <w:start w:val="single" w:sz="4" w:space="0" w:color="D5DFEC"/>
@@ -4150,10 +4098,10 @@
         </w:tblCellMar>
       </w:tblPr>
       <w:tblGrid>
-        <w:gridCol w:w="1900"/>
-        <w:gridCol w:w="3200"/>
-        <w:gridCol w:w="1700"/>
-        <w:gridCol w:w="2737"/>
+        <w:gridCol w:w="1899"/>
+        <w:gridCol w:w="3201"/>
+        <w:gridCol w:w="1699"/>
+        <w:gridCol w:w="2738"/>
       </w:tblGrid>
       <w:tr>
         <w:trPr>
@@ -4161,7 +4109,7 @@
         </w:trPr>
         <w:tc>
           <w:tcPr>
-            <w:tcW w:w="1900" w:type="dxa"/>
+            <w:tcW w:w="1899" w:type="dxa"/>
             <w:tcBorders>
               <w:top w:val="single" w:sz="4" w:space="0" w:color="D5DFEC"/>
               <w:start w:val="single" w:sz="4" w:space="0" w:color="D5DFEC"/>
@@ -4191,7 +4139,7 @@
         </w:tc>
         <w:tc>
           <w:tcPr>
-            <w:tcW w:w="3200" w:type="dxa"/>
+            <w:tcW w:w="3201" w:type="dxa"/>
             <w:tcBorders>
               <w:top w:val="single" w:sz="4" w:space="0" w:color="D5DFEC"/>
               <w:start w:val="single" w:sz="4" w:space="0" w:color="D5DFEC"/>
@@ -4221,7 +4169,7 @@
         </w:tc>
         <w:tc>
           <w:tcPr>
-            <w:tcW w:w="1700" w:type="dxa"/>
+            <w:tcW w:w="1699" w:type="dxa"/>
             <w:tcBorders>
               <w:top w:val="single" w:sz="4" w:space="0" w:color="D5DFEC"/>
               <w:start w:val="single" w:sz="4" w:space="0" w:color="D5DFEC"/>
@@ -4251,7 +4199,7 @@
         </w:tc>
         <w:tc>
           <w:tcPr>
-            <w:tcW w:w="2737" w:type="dxa"/>
+            <w:tcW w:w="2738" w:type="dxa"/>
             <w:tcBorders>
               <w:top w:val="single" w:sz="4" w:space="0" w:color="D5DFEC"/>
               <w:start w:val="single" w:sz="4" w:space="0" w:color="D5DFEC"/>
@@ -4284,7 +4232,7 @@
         <w:trPr/>
         <w:tc>
           <w:tcPr>
-            <w:tcW w:w="1900" w:type="dxa"/>
+            <w:tcW w:w="1899" w:type="dxa"/>
             <w:tcBorders>
               <w:top w:val="single" w:sz="4" w:space="0" w:color="D5DFEC"/>
               <w:start w:val="single" w:sz="4" w:space="0" w:color="D5DFEC"/>
@@ -4306,7 +4254,7 @@
         </w:tc>
         <w:tc>
           <w:tcPr>
-            <w:tcW w:w="3200" w:type="dxa"/>
+            <w:tcW w:w="3201" w:type="dxa"/>
             <w:tcBorders>
               <w:top w:val="single" w:sz="4" w:space="0" w:color="D5DFEC"/>
               <w:start w:val="single" w:sz="4" w:space="0" w:color="D5DFEC"/>
@@ -4328,7 +4276,7 @@
         </w:tc>
         <w:tc>
           <w:tcPr>
-            <w:tcW w:w="1700" w:type="dxa"/>
+            <w:tcW w:w="1699" w:type="dxa"/>
             <w:tcBorders>
               <w:top w:val="single" w:sz="4" w:space="0" w:color="D5DFEC"/>
               <w:start w:val="single" w:sz="4" w:space="0" w:color="D5DFEC"/>
@@ -4350,7 +4298,7 @@
         </w:tc>
         <w:tc>
           <w:tcPr>
-            <w:tcW w:w="2737" w:type="dxa"/>
+            <w:tcW w:w="2738" w:type="dxa"/>
             <w:tcBorders>
               <w:top w:val="single" w:sz="4" w:space="0" w:color="D5DFEC"/>
               <w:start w:val="single" w:sz="4" w:space="0" w:color="D5DFEC"/>
@@ -4375,7 +4323,7 @@
         <w:trPr/>
         <w:tc>
           <w:tcPr>
-            <w:tcW w:w="1900" w:type="dxa"/>
+            <w:tcW w:w="1899" w:type="dxa"/>
             <w:tcBorders>
               <w:top w:val="single" w:sz="4" w:space="0" w:color="D5DFEC"/>
               <w:start w:val="single" w:sz="4" w:space="0" w:color="D5DFEC"/>
@@ -4417,7 +4365,7 @@
         </w:tc>
         <w:tc>
           <w:tcPr>
-            <w:tcW w:w="3200" w:type="dxa"/>
+            <w:tcW w:w="3201" w:type="dxa"/>
             <w:tcBorders>
               <w:top w:val="single" w:sz="4" w:space="0" w:color="D5DFEC"/>
               <w:start w:val="single" w:sz="4" w:space="0" w:color="D5DFEC"/>
@@ -4439,7 +4387,7 @@
         </w:tc>
         <w:tc>
           <w:tcPr>
-            <w:tcW w:w="1700" w:type="dxa"/>
+            <w:tcW w:w="1699" w:type="dxa"/>
             <w:tcBorders>
               <w:top w:val="single" w:sz="4" w:space="0" w:color="D5DFEC"/>
               <w:start w:val="single" w:sz="4" w:space="0" w:color="D5DFEC"/>
@@ -4461,7 +4409,7 @@
         </w:tc>
         <w:tc>
           <w:tcPr>
-            <w:tcW w:w="2737" w:type="dxa"/>
+            <w:tcW w:w="2738" w:type="dxa"/>
             <w:tcBorders>
               <w:top w:val="single" w:sz="4" w:space="0" w:color="D5DFEC"/>
               <w:start w:val="single" w:sz="4" w:space="0" w:color="D5DFEC"/>
@@ -4486,7 +4434,7 @@
         <w:trPr/>
         <w:tc>
           <w:tcPr>
-            <w:tcW w:w="1900" w:type="dxa"/>
+            <w:tcW w:w="1899" w:type="dxa"/>
             <w:tcBorders>
               <w:top w:val="single" w:sz="4" w:space="0" w:color="D5DFEC"/>
               <w:start w:val="single" w:sz="4" w:space="0" w:color="D5DFEC"/>
@@ -4528,7 +4476,7 @@
         </w:tc>
         <w:tc>
           <w:tcPr>
-            <w:tcW w:w="3200" w:type="dxa"/>
+            <w:tcW w:w="3201" w:type="dxa"/>
             <w:tcBorders>
               <w:top w:val="single" w:sz="4" w:space="0" w:color="D5DFEC"/>
               <w:start w:val="single" w:sz="4" w:space="0" w:color="D5DFEC"/>
@@ -4550,7 +4498,7 @@
         </w:tc>
         <w:tc>
           <w:tcPr>
-            <w:tcW w:w="1700" w:type="dxa"/>
+            <w:tcW w:w="1699" w:type="dxa"/>
             <w:tcBorders>
               <w:top w:val="single" w:sz="4" w:space="0" w:color="D5DFEC"/>
               <w:start w:val="single" w:sz="4" w:space="0" w:color="D5DFEC"/>
@@ -4582,7 +4530,7 @@
         </w:tc>
         <w:tc>
           <w:tcPr>
-            <w:tcW w:w="2737" w:type="dxa"/>
+            <w:tcW w:w="2738" w:type="dxa"/>
             <w:tcBorders>
               <w:top w:val="single" w:sz="4" w:space="0" w:color="D5DFEC"/>
               <w:start w:val="single" w:sz="4" w:space="0" w:color="D5DFEC"/>
@@ -4607,7 +4555,7 @@
         <w:trPr/>
         <w:tc>
           <w:tcPr>
-            <w:tcW w:w="1900" w:type="dxa"/>
+            <w:tcW w:w="1899" w:type="dxa"/>
             <w:tcBorders>
               <w:top w:val="single" w:sz="4" w:space="0" w:color="D5DFEC"/>
               <w:start w:val="single" w:sz="4" w:space="0" w:color="D5DFEC"/>
@@ -4649,7 +4597,7 @@
         </w:tc>
         <w:tc>
           <w:tcPr>
-            <w:tcW w:w="3200" w:type="dxa"/>
+            <w:tcW w:w="3201" w:type="dxa"/>
             <w:tcBorders>
               <w:top w:val="single" w:sz="4" w:space="0" w:color="D5DFEC"/>
               <w:start w:val="single" w:sz="4" w:space="0" w:color="D5DFEC"/>
@@ -4691,7 +4639,7 @@
         </w:tc>
         <w:tc>
           <w:tcPr>
-            <w:tcW w:w="1700" w:type="dxa"/>
+            <w:tcW w:w="1699" w:type="dxa"/>
             <w:tcBorders>
               <w:top w:val="single" w:sz="4" w:space="0" w:color="D5DFEC"/>
               <w:start w:val="single" w:sz="4" w:space="0" w:color="D5DFEC"/>
@@ -4733,41 +4681,33 @@
         </w:tc>
         <w:tc>
           <w:tcPr>
-            <w:tcW w:w="2737" w:type="dxa"/>
-            <w:tcBorders>
-              <w:top w:val="single" w:sz="4" w:space="0" w:color="D5DFEC"/>
-              <w:start w:val="single" w:sz="4" w:space="0" w:color="D5DFEC"/>
-              <w:bottom w:val="single" w:sz="4" w:space="0" w:color="D5DFEC"/>
-              <w:end w:val="single" w:sz="4" w:space="0" w:color="D5DFEC"/>
-            </w:tcBorders>
-          </w:tcPr>
-          <w:p>
-            <w:pPr>
-              <w:pStyle w:val="Normal"/>
-              <w:spacing w:lineRule="auto" w:line="264" w:before="0" w:after="40"/>
-              <w:rPr/>
-            </w:pPr>
-            <w:r>
-              <w:rPr/>
-            </w:r>
-          </w:p>
-          <w:p>
-            <w:pPr>
-              <w:pStyle w:val="Normal"/>
-              <w:spacing w:before="0" w:after="40"/>
-              <w:rPr/>
-            </w:pPr>
-            <w:r>
-              <w:rPr/>
-              <w:t>Revoir la visibilité de l'entrée point (</w:t>
-            </w:r>
-            <w:r>
-              <w:rPr/>
-              <w:t>Appel a action</w:t>
-            </w:r>
-            <w:r>
-              <w:rPr/>
-              <w:t xml:space="preserve"> plus visible sur la fiche produit), ajouter un onboarding contextuel au 2e scan invitant à tester l'assistant </w:t>
+            <w:tcW w:w="2738" w:type="dxa"/>
+            <w:tcBorders>
+              <w:top w:val="single" w:sz="4" w:space="0" w:color="D5DFEC"/>
+              <w:start w:val="single" w:sz="4" w:space="0" w:color="D5DFEC"/>
+              <w:bottom w:val="single" w:sz="4" w:space="0" w:color="D5DFEC"/>
+              <w:end w:val="single" w:sz="4" w:space="0" w:color="D5DFEC"/>
+            </w:tcBorders>
+          </w:tcPr>
+          <w:p>
+            <w:pPr>
+              <w:pStyle w:val="Normal"/>
+              <w:spacing w:lineRule="auto" w:line="264" w:before="0" w:after="40"/>
+              <w:rPr/>
+            </w:pPr>
+            <w:r>
+              <w:rPr/>
+            </w:r>
+          </w:p>
+          <w:p>
+            <w:pPr>
+              <w:pStyle w:val="Normal"/>
+              <w:spacing w:before="0" w:after="40"/>
+              <w:rPr/>
+            </w:pPr>
+            <w:r>
+              <w:rPr/>
+              <w:t xml:space="preserve">Revoir la visibilité de l'entrée point (Appel a action plus visible sur la fiche produit), ajouter un onboarding contextuel au 2e scan invitant à tester l'assistant </w:t>
             </w:r>
           </w:p>
         </w:tc>
@@ -4776,149 +4716,161 @@
         <w:trPr/>
         <w:tc>
           <w:tcPr>
-            <w:tcW w:w="1900" w:type="dxa"/>
-            <w:tcBorders>
-              <w:top w:val="single" w:sz="4" w:space="0" w:color="D5DFEC"/>
-              <w:start w:val="single" w:sz="4" w:space="0" w:color="D5DFEC"/>
-              <w:bottom w:val="single" w:sz="4" w:space="0" w:color="D5DFEC"/>
-              <w:end w:val="single" w:sz="4" w:space="0" w:color="D5DFEC"/>
-            </w:tcBorders>
-          </w:tcPr>
-          <w:p>
-            <w:pPr>
-              <w:pStyle w:val="Normal"/>
-              <w:spacing w:lineRule="auto" w:line="264" w:before="0" w:after="40"/>
-              <w:rPr/>
-            </w:pPr>
-            <w:r>
-              <w:rPr/>
-              <w:t xml:space="preserve">Taux de substitution acceptée </w:t>
-            </w:r>
-          </w:p>
-          <w:p>
-            <w:pPr>
-              <w:pStyle w:val="Normal"/>
-              <w:spacing w:before="0" w:after="40"/>
-              <w:rPr/>
-            </w:pPr>
-            <w:r>
-              <w:rPr/>
-            </w:r>
-          </w:p>
-          <w:p>
-            <w:pPr>
-              <w:pStyle w:val="Normal"/>
-              <w:spacing w:before="0" w:after="40"/>
-              <w:rPr/>
-            </w:pPr>
-            <w:r>
-              <w:rPr/>
-            </w:r>
-          </w:p>
-        </w:tc>
-        <w:tc>
-          <w:tcPr>
-            <w:tcW w:w="3200" w:type="dxa"/>
-            <w:tcBorders>
-              <w:top w:val="single" w:sz="4" w:space="0" w:color="D5DFEC"/>
-              <w:start w:val="single" w:sz="4" w:space="0" w:color="D5DFEC"/>
-              <w:bottom w:val="single" w:sz="4" w:space="0" w:color="D5DFEC"/>
-              <w:end w:val="single" w:sz="4" w:space="0" w:color="D5DFEC"/>
-            </w:tcBorders>
-          </w:tcPr>
-          <w:p>
-            <w:pPr>
-              <w:pStyle w:val="Normal"/>
-              <w:spacing w:lineRule="auto" w:line="264" w:before="0" w:after="40"/>
-              <w:rPr/>
-            </w:pPr>
-            <w:r>
-              <w:rPr/>
-              <w:t>Substitutions cliquées, ajoutées en favori ou recherchées ensuite / Substitutions proposées par l'assistant</w:t>
-            </w:r>
-          </w:p>
-          <w:p>
-            <w:pPr>
-              <w:pStyle w:val="Normal"/>
-              <w:spacing w:before="0" w:after="40"/>
-              <w:rPr/>
-            </w:pPr>
-            <w:r>
-              <w:rPr/>
-            </w:r>
-          </w:p>
-          <w:p>
-            <w:pPr>
-              <w:pStyle w:val="Normal"/>
-              <w:spacing w:before="0" w:after="40"/>
-              <w:rPr/>
-            </w:pPr>
-            <w:r>
-              <w:rPr/>
-            </w:r>
-          </w:p>
-        </w:tc>
-        <w:tc>
-          <w:tcPr>
-            <w:tcW w:w="1700" w:type="dxa"/>
-            <w:tcBorders>
-              <w:top w:val="single" w:sz="4" w:space="0" w:color="D5DFEC"/>
-              <w:start w:val="single" w:sz="4" w:space="0" w:color="D5DFEC"/>
-              <w:bottom w:val="single" w:sz="4" w:space="0" w:color="D5DFEC"/>
-              <w:end w:val="single" w:sz="4" w:space="0" w:color="D5DFEC"/>
-            </w:tcBorders>
-          </w:tcPr>
-          <w:p>
-            <w:pPr>
-              <w:pStyle w:val="Normal"/>
-              <w:spacing w:lineRule="auto" w:line="264" w:before="0" w:after="40"/>
-              <w:rPr/>
-            </w:pPr>
-            <w:r>
-              <w:rPr/>
-              <w:t xml:space="preserve">Moins de 15 % de taux d'acceptation </w:t>
-            </w:r>
-          </w:p>
-          <w:p>
-            <w:pPr>
-              <w:pStyle w:val="Normal"/>
-              <w:spacing w:before="0" w:after="40"/>
-              <w:rPr/>
-            </w:pPr>
-            <w:r>
-              <w:rPr/>
-            </w:r>
-          </w:p>
-          <w:p>
-            <w:pPr>
-              <w:pStyle w:val="Normal"/>
-              <w:spacing w:before="0" w:after="40"/>
-              <w:rPr/>
-            </w:pPr>
-            <w:r>
-              <w:rPr/>
-            </w:r>
-          </w:p>
-        </w:tc>
-        <w:tc>
-          <w:tcPr>
-            <w:tcW w:w="2737" w:type="dxa"/>
-            <w:tcBorders>
-              <w:top w:val="single" w:sz="4" w:space="0" w:color="D5DFEC"/>
-              <w:start w:val="single" w:sz="4" w:space="0" w:color="D5DFEC"/>
-              <w:bottom w:val="single" w:sz="4" w:space="0" w:color="D5DFEC"/>
-              <w:end w:val="single" w:sz="4" w:space="0" w:color="D5DFEC"/>
-            </w:tcBorders>
-          </w:tcPr>
-          <w:p>
-            <w:pPr>
-              <w:pStyle w:val="Normal"/>
-              <w:spacing w:lineRule="auto" w:line="264" w:before="0" w:after="40"/>
-              <w:rPr/>
-            </w:pPr>
-            <w:r>
-              <w:rPr/>
-              <w:t xml:space="preserve">Analyser un échantillon de suggestions rejetées avec l'équipe data/IA pour identifier un biais de pertinence (prix, goût, disponibilité), ajuster les critères de scoring </w:t>
+            <w:tcW w:w="1899" w:type="dxa"/>
+            <w:tcBorders>
+              <w:top w:val="single" w:sz="4" w:space="0" w:color="D5DFEC"/>
+              <w:start w:val="single" w:sz="4" w:space="0" w:color="D5DFEC"/>
+              <w:bottom w:val="single" w:sz="4" w:space="0" w:color="D5DFEC"/>
+              <w:end w:val="single" w:sz="4" w:space="0" w:color="D5DFEC"/>
+            </w:tcBorders>
+          </w:tcPr>
+          <w:p>
+            <w:pPr>
+              <w:pStyle w:val="Normal"/>
+              <w:spacing w:lineRule="auto" w:line="264" w:before="0" w:after="40"/>
+              <w:rPr/>
+            </w:pPr>
+            <w:r>
+              <w:rPr/>
+              <w:t xml:space="preserve">Taux de substitution </w:t>
+            </w:r>
+            <w:r>
+              <w:rPr/>
+              <w:t>demandé</w:t>
+            </w:r>
+          </w:p>
+          <w:p>
+            <w:pPr>
+              <w:pStyle w:val="Normal"/>
+              <w:spacing w:before="0" w:after="40"/>
+              <w:rPr/>
+            </w:pPr>
+            <w:r>
+              <w:rPr/>
+            </w:r>
+          </w:p>
+          <w:p>
+            <w:pPr>
+              <w:pStyle w:val="Normal"/>
+              <w:spacing w:before="0" w:after="40"/>
+              <w:rPr/>
+            </w:pPr>
+            <w:r>
+              <w:rPr/>
+            </w:r>
+          </w:p>
+        </w:tc>
+        <w:tc>
+          <w:tcPr>
+            <w:tcW w:w="3201" w:type="dxa"/>
+            <w:tcBorders>
+              <w:top w:val="single" w:sz="4" w:space="0" w:color="D5DFEC"/>
+              <w:start w:val="single" w:sz="4" w:space="0" w:color="D5DFEC"/>
+              <w:bottom w:val="single" w:sz="4" w:space="0" w:color="D5DFEC"/>
+              <w:end w:val="single" w:sz="4" w:space="0" w:color="D5DFEC"/>
+            </w:tcBorders>
+          </w:tcPr>
+          <w:p>
+            <w:pPr>
+              <w:pStyle w:val="Normal"/>
+              <w:spacing w:lineRule="auto" w:line="264" w:before="0" w:after="40"/>
+              <w:rPr/>
+            </w:pPr>
+            <w:r>
+              <w:rPr/>
+              <w:t xml:space="preserve">Substitutions </w:t>
+            </w:r>
+            <w:r>
+              <w:rPr/>
+              <w:t>demandé suite à un scan d’article</w:t>
+            </w:r>
+          </w:p>
+          <w:p>
+            <w:pPr>
+              <w:pStyle w:val="Normal"/>
+              <w:spacing w:before="0" w:after="40"/>
+              <w:rPr/>
+            </w:pPr>
+            <w:r>
+              <w:rPr/>
+            </w:r>
+          </w:p>
+          <w:p>
+            <w:pPr>
+              <w:pStyle w:val="Normal"/>
+              <w:spacing w:before="0" w:after="40"/>
+              <w:rPr/>
+            </w:pPr>
+            <w:r>
+              <w:rPr/>
+            </w:r>
+          </w:p>
+        </w:tc>
+        <w:tc>
+          <w:tcPr>
+            <w:tcW w:w="1699" w:type="dxa"/>
+            <w:tcBorders>
+              <w:top w:val="single" w:sz="4" w:space="0" w:color="D5DFEC"/>
+              <w:start w:val="single" w:sz="4" w:space="0" w:color="D5DFEC"/>
+              <w:bottom w:val="single" w:sz="4" w:space="0" w:color="D5DFEC"/>
+              <w:end w:val="single" w:sz="4" w:space="0" w:color="D5DFEC"/>
+            </w:tcBorders>
+          </w:tcPr>
+          <w:p>
+            <w:pPr>
+              <w:pStyle w:val="Normal"/>
+              <w:spacing w:lineRule="auto" w:line="264" w:before="0" w:after="40"/>
+              <w:rPr/>
+            </w:pPr>
+            <w:r>
+              <w:rPr/>
+              <w:t xml:space="preserve">Moins </w:t>
+            </w:r>
+            <w:r>
+              <w:rPr/>
+              <w:t>25 % de demande de substitution sur le mois</w:t>
+            </w:r>
+          </w:p>
+          <w:p>
+            <w:pPr>
+              <w:pStyle w:val="Normal"/>
+              <w:spacing w:before="0" w:after="40"/>
+              <w:rPr/>
+            </w:pPr>
+            <w:r>
+              <w:rPr/>
+            </w:r>
+          </w:p>
+          <w:p>
+            <w:pPr>
+              <w:pStyle w:val="Normal"/>
+              <w:spacing w:before="0" w:after="40"/>
+              <w:rPr/>
+            </w:pPr>
+            <w:r>
+              <w:rPr/>
+            </w:r>
+          </w:p>
+        </w:tc>
+        <w:tc>
+          <w:tcPr>
+            <w:tcW w:w="2738" w:type="dxa"/>
+            <w:tcBorders>
+              <w:top w:val="single" w:sz="4" w:space="0" w:color="D5DFEC"/>
+              <w:start w:val="single" w:sz="4" w:space="0" w:color="D5DFEC"/>
+              <w:bottom w:val="single" w:sz="4" w:space="0" w:color="D5DFEC"/>
+              <w:end w:val="single" w:sz="4" w:space="0" w:color="D5DFEC"/>
+            </w:tcBorders>
+          </w:tcPr>
+          <w:p>
+            <w:pPr>
+              <w:pStyle w:val="Normal"/>
+              <w:spacing w:lineRule="auto" w:line="264" w:before="0" w:after="40"/>
+              <w:rPr/>
+            </w:pPr>
+            <w:r>
+              <w:rPr/>
+              <w:t xml:space="preserve">Analyser un échantillon de suggestions avec l'équipe data/IA pour identifier un biais de pertinence (prix, goût, disponibilité), ajuster les critères de scoring </w:t>
             </w:r>
           </w:p>
         </w:tc>
@@ -4927,7 +4879,7 @@
         <w:trPr/>
         <w:tc>
           <w:tcPr>
-            <w:tcW w:w="1900" w:type="dxa"/>
+            <w:tcW w:w="1899" w:type="dxa"/>
             <w:tcBorders>
               <w:start w:val="single" w:sz="4" w:space="0" w:color="D5DFEC"/>
               <w:bottom w:val="single" w:sz="4" w:space="0" w:color="D5DFEC"/>
@@ -4948,7 +4900,7 @@
         </w:tc>
         <w:tc>
           <w:tcPr>
-            <w:tcW w:w="3200" w:type="dxa"/>
+            <w:tcW w:w="3201" w:type="dxa"/>
             <w:tcBorders>
               <w:start w:val="single" w:sz="4" w:space="0" w:color="D5DFEC"/>
               <w:bottom w:val="single" w:sz="4" w:space="0" w:color="D5DFEC"/>
@@ -4969,7 +4921,7 @@
         </w:tc>
         <w:tc>
           <w:tcPr>
-            <w:tcW w:w="1700" w:type="dxa"/>
+            <w:tcW w:w="1699" w:type="dxa"/>
             <w:tcBorders>
               <w:start w:val="single" w:sz="4" w:space="0" w:color="D5DFEC"/>
               <w:bottom w:val="single" w:sz="4" w:space="0" w:color="D5DFEC"/>
@@ -4990,7 +4942,7 @@
         </w:tc>
         <w:tc>
           <w:tcPr>
-            <w:tcW w:w="2737" w:type="dxa"/>
+            <w:tcW w:w="2738" w:type="dxa"/>
             <w:tcBorders>
               <w:start w:val="single" w:sz="4" w:space="0" w:color="D5DFEC"/>
               <w:bottom w:val="single" w:sz="4" w:space="0" w:color="D5DFEC"/>
@@ -5529,6 +5481,7 @@
     <w:name w:val="Normal"/>
     <w:pPr>
       <w:widowControl/>
+      <w:suppressAutoHyphens w:val="true"/>
       <w:bidi w:val="0"/>
       <w:spacing w:lineRule="auto" w:line="276" w:before="0" w:after="120"/>
       <w:jc w:val="start"/>
@@ -5544,7 +5497,7 @@
   </w:style>
   <w:style w:type="paragraph" w:styleId="Heading1">
     <w:name w:val="heading 1"/>
-    <w:basedOn w:val="Titre"/>
+    <w:basedOn w:val="Titreuser"/>
     <w:qFormat/>
     <w:pPr>
       <w:pBdr>
@@ -5563,7 +5516,7 @@
   </w:style>
   <w:style w:type="paragraph" w:styleId="Heading2">
     <w:name w:val="heading 2"/>
-    <w:basedOn w:val="Titre"/>
+    <w:basedOn w:val="Titreuser"/>
     <w:qFormat/>
     <w:pPr>
       <w:spacing w:before="220" w:after="100"/>
@@ -5579,7 +5532,7 @@
   </w:style>
   <w:style w:type="paragraph" w:styleId="Heading3">
     <w:name w:val="heading 3"/>
-    <w:basedOn w:val="Titre"/>
+    <w:basedOn w:val="Titreuser"/>
     <w:qFormat/>
     <w:pPr/>
     <w:rPr>
@@ -5590,7 +5543,7 @@
   </w:style>
   <w:style w:type="paragraph" w:styleId="Heading4">
     <w:name w:val="heading 4"/>
-    <w:basedOn w:val="Titre"/>
+    <w:basedOn w:val="Titreuser"/>
     <w:qFormat/>
     <w:pPr/>
     <w:rPr>
@@ -5601,7 +5554,7 @@
   </w:style>
   <w:style w:type="paragraph" w:styleId="Heading5">
     <w:name w:val="heading 5"/>
-    <w:basedOn w:val="Titre"/>
+    <w:basedOn w:val="Titreuser"/>
     <w:qFormat/>
     <w:pPr/>
     <w:rPr>
@@ -5610,7 +5563,7 @@
   </w:style>
   <w:style w:type="paragraph" w:styleId="Heading6">
     <w:name w:val="heading 6"/>
-    <w:basedOn w:val="Titre"/>
+    <w:basedOn w:val="Titreuser"/>
     <w:qFormat/>
     <w:pPr/>
     <w:rPr>
@@ -5626,11 +5579,17 @@
       <w:u w:val="single"/>
     </w:rPr>
   </w:style>
-  <w:style w:type="character" w:styleId="Caractresdenotedebasdepage">
-    <w:name w:val="Caractères de note de bas de page"/>
+  <w:style w:type="character" w:styleId="Caractresdenotedebasdepageuser">
+    <w:name w:val="Caractères de note de bas de page (user)"/>
     <w:uiPriority w:val="99"/>
     <w:semiHidden/>
     <w:unhideWhenUsed/>
+    <w:rPr>
+      <w:vertAlign w:val="superscript"/>
+    </w:rPr>
+  </w:style>
+  <w:style w:type="character" w:styleId="Caractresdenotedebasdepage">
+    <w:name w:val="Caractères de note de bas de page"/>
     <w:rPr>
       <w:vertAlign w:val="superscript"/>
     </w:rPr>
@@ -5651,11 +5610,17 @@
       <w:szCs w:val="20"/>
     </w:rPr>
   </w:style>
-  <w:style w:type="character" w:styleId="Caractresdenotedefin">
-    <w:name w:val="Caractères de note de fin"/>
+  <w:style w:type="character" w:styleId="Caractresdenotedefinuser">
+    <w:name w:val="Caractères de note de fin (user)"/>
     <w:uiPriority w:val="99"/>
     <w:semiHidden/>
     <w:unhideWhenUsed/>
+    <w:rPr>
+      <w:vertAlign w:val="superscript"/>
+    </w:rPr>
+  </w:style>
+  <w:style w:type="character" w:styleId="Caractresdenotedefin">
+    <w:name w:val="Caractères de note de fin"/>
     <w:rPr>
       <w:vertAlign w:val="superscript"/>
     </w:rPr>
@@ -5738,9 +5703,23 @@
       <w:rFonts w:cs="Arial"/>
     </w:rPr>
   </w:style>
+  <w:style w:type="paragraph" w:styleId="Titreuser">
+    <w:name w:val="Titre (user)"/>
+    <w:basedOn w:val="Normal"/>
+    <w:next w:val="BodyText"/>
+    <w:pPr>
+      <w:keepNext w:val="true"/>
+      <w:spacing w:before="240" w:after="120"/>
+    </w:pPr>
+    <w:rPr>
+      <w:rFonts w:ascii="Liberation Sans" w:hAnsi="Liberation Sans" w:eastAsia="Microsoft YaHei" w:cs="Arial"/>
+      <w:sz w:val="28"/>
+      <w:szCs w:val="28"/>
+    </w:rPr>
+  </w:style>
   <w:style w:type="paragraph" w:styleId="Title">
     <w:name w:val="Title"/>
-    <w:basedOn w:val="Titre"/>
+    <w:basedOn w:val="Titreuser"/>
     <w:qFormat/>
     <w:pPr/>
     <w:rPr>
@@ -5753,6 +5732,7 @@
     <w:qFormat/>
     <w:pPr>
       <w:widowControl/>
+      <w:suppressAutoHyphens w:val="true"/>
       <w:bidi w:val="0"/>
       <w:spacing w:lineRule="auto" w:line="276" w:before="0" w:after="120"/>
       <w:jc w:val="start"/>
@@ -5773,6 +5753,7 @@
     <w:qFormat/>
     <w:pPr>
       <w:widowControl/>
+      <w:suppressAutoHyphens w:val="true"/>
       <w:bidi w:val="0"/>
       <w:spacing w:lineRule="auto" w:line="276" w:before="0" w:after="120"/>
       <w:jc w:val="start"/>

</xml_diff>